<commit_message>
Project 1 Final Report - analysis code updates, report updates, and uploading presentation
</commit_message>
<xml_diff>
--- a/Project 1/Reports/Project 1 - Final Report.docx
+++ b/Project 1/Reports/Project 1 - Final Report.docx
@@ -78,7 +78,19 @@
         <w:rPr>
           <w:rFonts w:asciiTheme="majorBidi" w:hAnsiTheme="majorBidi" w:cstheme="majorBidi"/>
         </w:rPr>
-        <w:t>. The study collects both laboratory and quality of life measures of subjects at baseline and then annually after starting HAART. The primary measures of interest included viral load, CD4+ T cell counts, physical quality of life scores and mental quality of life scores.</w:t>
+        <w:t>. The study collect</w:t>
+      </w:r>
+      <w:r>
+        <w:rPr>
+          <w:rFonts w:asciiTheme="majorBidi" w:hAnsiTheme="majorBidi" w:cstheme="majorBidi"/>
+        </w:rPr>
+        <w:t>ed</w:t>
+      </w:r>
+      <w:r>
+        <w:rPr>
+          <w:rFonts w:asciiTheme="majorBidi" w:hAnsiTheme="majorBidi" w:cstheme="majorBidi"/>
+        </w:rPr>
+        <w:t xml:space="preserve"> both laboratory and quality of life measures of subjects at baseline and then annually after starting HAART. </w:t>
       </w:r>
     </w:p>
     <w:p>
@@ -98,7 +110,19 @@
         <w:rPr>
           <w:rFonts w:asciiTheme="majorBidi" w:hAnsiTheme="majorBidi" w:cstheme="majorBidi"/>
         </w:rPr>
-        <w:t xml:space="preserve">imited evidence in </w:t>
+        <w:t>imited evidence</w:t>
+      </w:r>
+      <w:r>
+        <w:rPr>
+          <w:rFonts w:asciiTheme="majorBidi" w:hAnsiTheme="majorBidi" w:cstheme="majorBidi"/>
+        </w:rPr>
+        <w:t>,</w:t>
+      </w:r>
+      <w:r>
+        <w:rPr>
+          <w:rFonts w:asciiTheme="majorBidi" w:hAnsiTheme="majorBidi" w:cstheme="majorBidi"/>
+        </w:rPr>
+        <w:t xml:space="preserve"> in </w:t>
       </w:r>
       <w:r>
         <w:rPr>
@@ -116,13 +140,37 @@
         <w:rPr>
           <w:rFonts w:asciiTheme="majorBidi" w:hAnsiTheme="majorBidi" w:cstheme="majorBidi"/>
         </w:rPr>
-        <w:t>settings that</w:t>
-      </w:r>
-      <w:r>
-        <w:rPr>
-          <w:rFonts w:asciiTheme="majorBidi" w:hAnsiTheme="majorBidi" w:cstheme="majorBidi"/>
-        </w:rPr>
-        <w:t xml:space="preserve"> suggest hard drug use may inhibit the immune system and increase HIV replication. However, these findings have not been reproduced in human studies thus far. If hard drugs do indeed impair treatment response in</w:t>
+        <w:t>settings</w:t>
+      </w:r>
+      <w:r>
+        <w:rPr>
+          <w:rFonts w:asciiTheme="majorBidi" w:hAnsiTheme="majorBidi" w:cstheme="majorBidi"/>
+        </w:rPr>
+        <w:t>,</w:t>
+      </w:r>
+      <w:r>
+        <w:rPr>
+          <w:rFonts w:asciiTheme="majorBidi" w:hAnsiTheme="majorBidi" w:cstheme="majorBidi"/>
+        </w:rPr>
+        <w:t xml:space="preserve"> that</w:t>
+      </w:r>
+      <w:r>
+        <w:rPr>
+          <w:rFonts w:asciiTheme="majorBidi" w:hAnsiTheme="majorBidi" w:cstheme="majorBidi"/>
+        </w:rPr>
+        <w:t xml:space="preserve"> suggest</w:t>
+      </w:r>
+      <w:r>
+        <w:rPr>
+          <w:rFonts w:asciiTheme="majorBidi" w:hAnsiTheme="majorBidi" w:cstheme="majorBidi"/>
+        </w:rPr>
+        <w:t>s</w:t>
+      </w:r>
+      <w:r>
+        <w:rPr>
+          <w:rFonts w:asciiTheme="majorBidi" w:hAnsiTheme="majorBidi" w:cstheme="majorBidi"/>
+        </w:rPr>
+        <w:t xml:space="preserve"> hard drug use may inhibit the immune system and increase HIV replication. However, these findings have not been reproduced in human studies thus far. If hard drugs do indeed impair treatment response in</w:t>
       </w:r>
       <w:r>
         <w:rPr>
@@ -152,19 +200,61 @@
         <w:rPr>
           <w:rFonts w:asciiTheme="majorBidi" w:hAnsiTheme="majorBidi" w:cstheme="majorBidi"/>
         </w:rPr>
-        <w:t xml:space="preserve">With this information, the investigator aimed to assess the difference in treatment response 2 years after starting HAART between subjects who reported using hard drugs at baseline and those who did not. The investigator was also interested in exploring whether adherence accounted for some of the difference in treatment response between the two hard drug use groups. To address these research </w:t>
-      </w:r>
-      <w:r>
-        <w:rPr>
-          <w:rFonts w:asciiTheme="majorBidi" w:hAnsiTheme="majorBidi" w:cstheme="majorBidi"/>
-        </w:rPr>
-        <w:t>questions,</w:t>
-      </w:r>
-      <w:r>
-        <w:rPr>
-          <w:rFonts w:asciiTheme="majorBidi" w:hAnsiTheme="majorBidi" w:cstheme="majorBidi"/>
-        </w:rPr>
-        <w:t xml:space="preserve"> we assessed whether there was a significant coefficient associated with hard drug use and whether incorporating adherence significantly affects that coefficient.</w:t>
+        <w:t>Given this gap in the literature</w:t>
+      </w:r>
+      <w:r>
+        <w:rPr>
+          <w:rFonts w:asciiTheme="majorBidi" w:hAnsiTheme="majorBidi" w:cstheme="majorBidi"/>
+        </w:rPr>
+        <w:t xml:space="preserve">, the investigator aimed to assess the difference in treatment response 2 years after starting HAART between subjects who reported using hard drugs at baseline and those who did not. The investigator was also interested in exploring whether adherence accounted for some of the difference in treatment response between the two hard drug use groups. </w:t>
+      </w:r>
+      <w:r>
+        <w:rPr>
+          <w:rFonts w:asciiTheme="majorBidi" w:hAnsiTheme="majorBidi" w:cstheme="majorBidi"/>
+        </w:rPr>
+        <w:t xml:space="preserve">The measures of </w:t>
+      </w:r>
+      <w:r>
+        <w:rPr>
+          <w:rFonts w:asciiTheme="majorBidi" w:hAnsiTheme="majorBidi" w:cstheme="majorBidi"/>
+        </w:rPr>
+        <w:t xml:space="preserve">treatment response </w:t>
+      </w:r>
+      <w:r>
+        <w:rPr>
+          <w:rFonts w:asciiTheme="majorBidi" w:hAnsiTheme="majorBidi" w:cstheme="majorBidi"/>
+        </w:rPr>
+        <w:t>included viral load, CD4+ T cell counts, physical quality of life scores and mental quality of life scores.</w:t>
+      </w:r>
+      <w:r>
+        <w:rPr>
+          <w:rFonts w:asciiTheme="majorBidi" w:hAnsiTheme="majorBidi" w:cstheme="majorBidi"/>
+        </w:rPr>
+        <w:t xml:space="preserve"> </w:t>
+      </w:r>
+      <w:r>
+        <w:rPr>
+          <w:rFonts w:asciiTheme="majorBidi" w:hAnsiTheme="majorBidi" w:cstheme="majorBidi"/>
+        </w:rPr>
+        <w:t xml:space="preserve">To address these questions, we evaluated the association between baseline hard drug use and each treatment </w:t>
+      </w:r>
+      <w:r>
+        <w:rPr>
+          <w:rFonts w:asciiTheme="majorBidi" w:hAnsiTheme="majorBidi" w:cstheme="majorBidi"/>
+        </w:rPr>
+        <w:t>outcome and</w:t>
+      </w:r>
+      <w:r>
+        <w:rPr>
+          <w:rFonts w:asciiTheme="majorBidi" w:hAnsiTheme="majorBidi" w:cstheme="majorBidi"/>
+        </w:rPr>
+        <w:t xml:space="preserve"> explored whether treatment adherence could account for any observed differences</w:t>
+      </w:r>
+      <w:r>
+        <w:rPr>
+          <w:rFonts w:asciiTheme="majorBidi" w:hAnsiTheme="majorBidi" w:cstheme="majorBidi"/>
+        </w:rPr>
+        <w:t>.</w:t>
       </w:r>
     </w:p>
     <w:p>
@@ -303,38 +393,144 @@
         <w:rPr>
           <w:rFonts w:ascii="Times New Roman" w:hAnsi="Times New Roman" w:cs="Times New Roman"/>
         </w:rPr>
-        <w:t xml:space="preserve">Participants missing either of these two visits were removed. </w:t>
-      </w:r>
-      <w:r>
-        <w:rPr>
-          <w:rFonts w:ascii="Times New Roman" w:hAnsi="Times New Roman" w:cs="Times New Roman"/>
-        </w:rPr>
-        <w:t>This produced a total of 1,</w:t>
-      </w:r>
-      <w:r>
-        <w:rPr>
-          <w:rFonts w:ascii="Times New Roman" w:hAnsi="Times New Roman" w:cs="Times New Roman"/>
-        </w:rPr>
-        <w:t>012</w:t>
-      </w:r>
-      <w:r>
-        <w:rPr>
-          <w:rFonts w:ascii="Times New Roman" w:hAnsi="Times New Roman" w:cs="Times New Roman"/>
-        </w:rPr>
-        <w:t xml:space="preserve"> observations</w:t>
-      </w:r>
-      <w:r>
-        <w:rPr>
-          <w:rFonts w:ascii="Times New Roman" w:hAnsi="Times New Roman" w:cs="Times New Roman"/>
-        </w:rPr>
-        <w:t xml:space="preserve"> from 506 unique participants</w:t>
-      </w:r>
-      <w:r>
-        <w:rPr>
-          <w:rFonts w:ascii="Times New Roman" w:hAnsi="Times New Roman" w:cs="Times New Roman"/>
+        <w:t>Participants missing either of these two visits were removed. This produced a total of 1,012 observations from 506 unique participants.</w:t>
+      </w:r>
+      <w:r>
+        <w:rPr>
+          <w:rFonts w:ascii="Times New Roman" w:hAnsi="Times New Roman" w:cs="Times New Roman"/>
+        </w:rPr>
+        <w:t xml:space="preserve"> </w:t>
+      </w:r>
+      <w:r>
+        <w:rPr>
+          <w:rFonts w:ascii="Times New Roman" w:hAnsi="Times New Roman" w:cs="Times New Roman"/>
+        </w:rPr>
+        <w:t>An additional 13 participants were excluded due to biologically implausible recorded BMIs, less than 6.7 kg/m</w:t>
+      </w:r>
+      <w:r>
+        <w:rPr>
+          <w:rFonts w:ascii="Times New Roman" w:hAnsi="Times New Roman" w:cs="Times New Roman"/>
+          <w:vertAlign w:val="superscript"/>
+        </w:rPr>
+        <w:t>2</w:t>
+      </w:r>
+      <w:r>
+        <w:rPr>
+          <w:rFonts w:ascii="Times New Roman" w:hAnsi="Times New Roman" w:cs="Times New Roman"/>
+        </w:rPr>
+        <w:t xml:space="preserve"> or greater than 250 </w:t>
+      </w:r>
+      <w:r>
+        <w:rPr>
+          <w:rFonts w:ascii="Times New Roman" w:hAnsi="Times New Roman" w:cs="Times New Roman"/>
+        </w:rPr>
+        <w:t>kg/m</w:t>
+      </w:r>
+      <w:r>
+        <w:rPr>
+          <w:rFonts w:ascii="Times New Roman" w:hAnsi="Times New Roman" w:cs="Times New Roman"/>
+          <w:vertAlign w:val="superscript"/>
+        </w:rPr>
+        <w:t>2</w:t>
+      </w:r>
+      <w:r>
+        <w:rPr>
+          <w:rFonts w:ascii="Times New Roman" w:hAnsi="Times New Roman" w:cs="Times New Roman"/>
+        </w:rPr>
+        <w:t xml:space="preserve">. Another 17 were removed due to failure to report income. Finally, 30 participants were excluded for missing any of the outcomes of interest at either baseline or year </w:t>
+      </w:r>
+      <w:r>
+        <w:rPr>
+          <w:rFonts w:asciiTheme="majorBidi" w:hAnsiTheme="majorBidi" w:cstheme="majorBidi"/>
+        </w:rPr>
+        <w:t xml:space="preserve">two. </w:t>
+      </w:r>
+      <w:r>
+        <w:rPr>
+          <w:rFonts w:asciiTheme="majorBidi" w:hAnsiTheme="majorBidi" w:cstheme="majorBidi"/>
+        </w:rPr>
+        <w:t>After applying all exclusion criteria, the final analytic sample consisted of 446 unique participants</w:t>
+      </w:r>
+      <w:r>
+        <w:rPr>
+          <w:rFonts w:asciiTheme="majorBidi" w:hAnsiTheme="majorBidi" w:cstheme="majorBidi"/>
         </w:rPr>
         <w:t>.</w:t>
       </w:r>
+    </w:p>
+    <w:p>
+      <w:pPr>
+        <w:spacing w:after="0" w:line="480" w:lineRule="auto"/>
+        <w:rPr>
+          <w:rFonts w:ascii="Times New Roman" w:hAnsi="Times New Roman" w:cs="Times New Roman"/>
+        </w:rPr>
+      </w:pPr>
+      <w:r>
+        <w:rPr>
+          <w:rFonts w:ascii="Times New Roman" w:hAnsi="Times New Roman" w:cs="Times New Roman"/>
+        </w:rPr>
+        <w:t>The necessity of transforming the four outcomes of interest was assessed to avoid potential model assumption violations. Viral load was log</w:t>
+      </w:r>
+      <w:r>
+        <w:rPr>
+          <w:rFonts w:ascii="Times New Roman" w:hAnsi="Times New Roman" w:cs="Times New Roman"/>
+        </w:rPr>
+        <w:t>10</w:t>
+      </w:r>
+      <w:r>
+        <w:rPr>
+          <w:rFonts w:ascii="Times New Roman" w:hAnsi="Times New Roman" w:cs="Times New Roman"/>
+        </w:rPr>
+        <w:t xml:space="preserve"> transformed due to substantial right skewness. The remaining three outcomes exhibited mild skewness and were </w:t>
+      </w:r>
+      <w:r>
+        <w:rPr>
+          <w:rFonts w:ascii="Times New Roman" w:hAnsi="Times New Roman" w:cs="Times New Roman"/>
+        </w:rPr>
+        <w:t>retained in their original scale</w:t>
+      </w:r>
+      <w:r>
+        <w:rPr>
+          <w:rFonts w:ascii="Times New Roman" w:hAnsi="Times New Roman" w:cs="Times New Roman"/>
+        </w:rPr>
+        <w:t>. This decision w</w:t>
+      </w:r>
+      <w:r>
+        <w:rPr>
+          <w:rFonts w:ascii="Times New Roman" w:hAnsi="Times New Roman" w:cs="Times New Roman"/>
+        </w:rPr>
+        <w:t>as</w:t>
+      </w:r>
+      <w:r>
+        <w:rPr>
+          <w:rFonts w:ascii="Times New Roman" w:hAnsi="Times New Roman" w:cs="Times New Roman"/>
+        </w:rPr>
+        <w:t xml:space="preserve"> verified through</w:t>
+      </w:r>
+      <w:r>
+        <w:rPr>
+          <w:rFonts w:ascii="Times New Roman" w:hAnsi="Times New Roman" w:cs="Times New Roman"/>
+        </w:rPr>
+        <w:t xml:space="preserve"> residual</w:t>
+      </w:r>
+      <w:r>
+        <w:rPr>
+          <w:rFonts w:ascii="Times New Roman" w:hAnsi="Times New Roman" w:cs="Times New Roman"/>
+        </w:rPr>
+        <w:t xml:space="preserve"> diagnostic plots from the fitted model</w:t>
+      </w:r>
+      <w:r>
+        <w:rPr>
+          <w:rFonts w:ascii="Times New Roman" w:hAnsi="Times New Roman" w:cs="Times New Roman"/>
+        </w:rPr>
+        <w:t>s</w:t>
+      </w:r>
+      <w:r>
+        <w:rPr>
+          <w:rFonts w:ascii="Times New Roman" w:hAnsi="Times New Roman" w:cs="Times New Roman"/>
+        </w:rPr>
+        <w:t>.</w:t>
+      </w:r>
       <w:r>
         <w:rPr>
           <w:rFonts w:ascii="Times New Roman" w:hAnsi="Times New Roman" w:cs="Times New Roman"/>
@@ -345,55 +541,61 @@
         <w:rPr>
           <w:rFonts w:ascii="Times New Roman" w:hAnsi="Times New Roman" w:cs="Times New Roman"/>
         </w:rPr>
-        <w:t>An additional 13 participants were excluded due to biologically implausible recorded BMIs, less than 6.7 kg/m</w:t>
-      </w:r>
-      <w:r>
-        <w:rPr>
-          <w:rFonts w:ascii="Times New Roman" w:hAnsi="Times New Roman" w:cs="Times New Roman"/>
-          <w:vertAlign w:val="superscript"/>
-        </w:rPr>
-        <w:t>2</w:t>
-      </w:r>
-      <w:r>
-        <w:rPr>
-          <w:rFonts w:ascii="Times New Roman" w:hAnsi="Times New Roman" w:cs="Times New Roman"/>
-        </w:rPr>
-        <w:t xml:space="preserve"> or greater than 250 </w:t>
-      </w:r>
-      <w:r>
-        <w:rPr>
-          <w:rFonts w:ascii="Times New Roman" w:hAnsi="Times New Roman" w:cs="Times New Roman"/>
-        </w:rPr>
-        <w:t>kg/m</w:t>
-      </w:r>
-      <w:r>
-        <w:rPr>
-          <w:rFonts w:ascii="Times New Roman" w:hAnsi="Times New Roman" w:cs="Times New Roman"/>
-          <w:vertAlign w:val="superscript"/>
-        </w:rPr>
-        <w:t>2</w:t>
-      </w:r>
-      <w:r>
-        <w:rPr>
-          <w:rFonts w:ascii="Times New Roman" w:hAnsi="Times New Roman" w:cs="Times New Roman"/>
-        </w:rPr>
-        <w:t xml:space="preserve">. Another 17 were removed due to failure to report income. Finally, 30 participants were excluded for missing any of the outcomes of interest at either baseline or year </w:t>
-      </w:r>
-      <w:r>
-        <w:rPr>
-          <w:rFonts w:asciiTheme="majorBidi" w:hAnsiTheme="majorBidi" w:cstheme="majorBidi"/>
-        </w:rPr>
-        <w:t xml:space="preserve">two. </w:t>
-      </w:r>
-      <w:r>
-        <w:rPr>
-          <w:rFonts w:asciiTheme="majorBidi" w:hAnsiTheme="majorBidi" w:cstheme="majorBidi"/>
-        </w:rPr>
-        <w:t>After applying all exclusion criteria, the final analytic sample consisted of 446 unique participants</w:t>
-      </w:r>
-      <w:r>
-        <w:rPr>
-          <w:rFonts w:asciiTheme="majorBidi" w:hAnsiTheme="majorBidi" w:cstheme="majorBidi"/>
+        <w:t xml:space="preserve">Almost </w:t>
+      </w:r>
+      <w:proofErr w:type="gramStart"/>
+      <w:r>
+        <w:rPr>
+          <w:rFonts w:ascii="Times New Roman" w:hAnsi="Times New Roman" w:cs="Times New Roman"/>
+        </w:rPr>
+        <w:t>all of</w:t>
+      </w:r>
+      <w:proofErr w:type="gramEnd"/>
+      <w:r>
+        <w:rPr>
+          <w:rFonts w:ascii="Times New Roman" w:hAnsi="Times New Roman" w:cs="Times New Roman"/>
+        </w:rPr>
+        <w:t xml:space="preserve"> the c</w:t>
+      </w:r>
+      <w:r>
+        <w:rPr>
+          <w:rFonts w:ascii="Times New Roman" w:hAnsi="Times New Roman" w:cs="Times New Roman"/>
+        </w:rPr>
+        <w:t xml:space="preserve">ategorical covariates were </w:t>
+      </w:r>
+      <w:r>
+        <w:rPr>
+          <w:rFonts w:ascii="Times New Roman" w:hAnsi="Times New Roman" w:cs="Times New Roman"/>
+        </w:rPr>
+        <w:t>consolidated</w:t>
+      </w:r>
+      <w:r>
+        <w:rPr>
+          <w:rFonts w:ascii="Times New Roman" w:hAnsi="Times New Roman" w:cs="Times New Roman"/>
+        </w:rPr>
+        <w:t xml:space="preserve"> after consulting </w:t>
+      </w:r>
+      <w:r>
+        <w:rPr>
+          <w:rFonts w:ascii="Times New Roman" w:hAnsi="Times New Roman" w:cs="Times New Roman"/>
+        </w:rPr>
+        <w:t xml:space="preserve">the </w:t>
+      </w:r>
+      <w:r>
+        <w:rPr>
+          <w:rFonts w:ascii="Times New Roman" w:hAnsi="Times New Roman" w:cs="Times New Roman"/>
+        </w:rPr>
+        <w:t xml:space="preserve">investigator to </w:t>
+      </w:r>
+      <w:r>
+        <w:rPr>
+          <w:rFonts w:ascii="Times New Roman" w:hAnsi="Times New Roman" w:cs="Times New Roman"/>
+        </w:rPr>
+        <w:t>address sparse data at certain levels</w:t>
+      </w:r>
+      <w:r>
+        <w:rPr>
+          <w:rFonts w:ascii="Times New Roman" w:hAnsi="Times New Roman" w:cs="Times New Roman"/>
         </w:rPr>
         <w:t>.</w:t>
       </w:r>
@@ -403,132 +605,58 @@
         <w:spacing w:after="0" w:line="480" w:lineRule="auto"/>
         <w:rPr>
           <w:rFonts w:ascii="Times New Roman" w:hAnsi="Times New Roman" w:cs="Times New Roman"/>
-        </w:rPr>
-      </w:pPr>
-      <w:r>
-        <w:rPr>
-          <w:rFonts w:ascii="Times New Roman" w:hAnsi="Times New Roman" w:cs="Times New Roman"/>
-        </w:rPr>
-        <w:t>The necessity of transforming the four outcomes of interest was assessed to avoid potential model assumption violations. Viral load was log</w:t>
-      </w:r>
-      <w:r>
-        <w:rPr>
-          <w:rFonts w:ascii="Times New Roman" w:hAnsi="Times New Roman" w:cs="Times New Roman"/>
-        </w:rPr>
-        <w:t>10</w:t>
-      </w:r>
-      <w:r>
-        <w:rPr>
-          <w:rFonts w:ascii="Times New Roman" w:hAnsi="Times New Roman" w:cs="Times New Roman"/>
-        </w:rPr>
-        <w:t xml:space="preserve"> transformed due to substantial right skewness. The remaining three outcomes exhibited mild skewness and were </w:t>
-      </w:r>
-      <w:r>
-        <w:rPr>
-          <w:rFonts w:ascii="Times New Roman" w:hAnsi="Times New Roman" w:cs="Times New Roman"/>
-        </w:rPr>
-        <w:t>retained in their original scale</w:t>
-      </w:r>
-      <w:r>
-        <w:rPr>
-          <w:rFonts w:ascii="Times New Roman" w:hAnsi="Times New Roman" w:cs="Times New Roman"/>
-        </w:rPr>
-        <w:t>.  This decision w</w:t>
-      </w:r>
-      <w:r>
-        <w:rPr>
-          <w:rFonts w:ascii="Times New Roman" w:hAnsi="Times New Roman" w:cs="Times New Roman"/>
-        </w:rPr>
-        <w:t>as</w:t>
-      </w:r>
-      <w:r>
-        <w:rPr>
-          <w:rFonts w:ascii="Times New Roman" w:hAnsi="Times New Roman" w:cs="Times New Roman"/>
-        </w:rPr>
-        <w:t xml:space="preserve"> verified through</w:t>
-      </w:r>
-      <w:r>
-        <w:rPr>
-          <w:rFonts w:ascii="Times New Roman" w:hAnsi="Times New Roman" w:cs="Times New Roman"/>
-        </w:rPr>
-        <w:t xml:space="preserve"> residual</w:t>
-      </w:r>
-      <w:r>
-        <w:rPr>
-          <w:rFonts w:ascii="Times New Roman" w:hAnsi="Times New Roman" w:cs="Times New Roman"/>
-        </w:rPr>
-        <w:t xml:space="preserve"> diagnostic plots from the fitted model</w:t>
-      </w:r>
-      <w:r>
-        <w:rPr>
-          <w:rFonts w:ascii="Times New Roman" w:hAnsi="Times New Roman" w:cs="Times New Roman"/>
-        </w:rPr>
-        <w:t>s</w:t>
-      </w:r>
-      <w:r>
-        <w:rPr>
-          <w:rFonts w:ascii="Times New Roman" w:hAnsi="Times New Roman" w:cs="Times New Roman"/>
+          <w:b/>
+          <w:bCs/>
+        </w:rPr>
+      </w:pPr>
+      <w:r>
+        <w:rPr>
+          <w:rFonts w:ascii="Times New Roman" w:hAnsi="Times New Roman" w:cs="Times New Roman"/>
+          <w:b/>
+          <w:bCs/>
+        </w:rPr>
+        <w:t>2.2 Statistical Analysis</w:t>
+      </w:r>
+    </w:p>
+    <w:p>
+      <w:pPr>
+        <w:spacing w:after="0" w:line="480" w:lineRule="auto"/>
+        <w:rPr>
+          <w:rFonts w:asciiTheme="majorBidi" w:hAnsiTheme="majorBidi" w:cstheme="majorBidi"/>
+        </w:rPr>
+      </w:pPr>
+      <w:r>
+        <w:rPr>
+          <w:rFonts w:asciiTheme="majorBidi" w:hAnsiTheme="majorBidi" w:cstheme="majorBidi"/>
+        </w:rPr>
+        <w:t>The impact of baseline hard drug use on treatment response was evaluated for each of the four outcomes of interest using both frequentist and Bayesian linear regression frameworks. Those outcomes were viral load, CD4+ T cell count, physical quality of life</w:t>
+      </w:r>
+      <w:r>
+        <w:rPr>
+          <w:rFonts w:asciiTheme="majorBidi" w:hAnsiTheme="majorBidi" w:cstheme="majorBidi"/>
+        </w:rPr>
+        <w:t xml:space="preserve"> scores</w:t>
+      </w:r>
+      <w:r>
+        <w:rPr>
+          <w:rFonts w:asciiTheme="majorBidi" w:hAnsiTheme="majorBidi" w:cstheme="majorBidi"/>
+        </w:rPr>
+        <w:t>, and mental quality of life</w:t>
+      </w:r>
+      <w:r>
+        <w:rPr>
+          <w:rFonts w:asciiTheme="majorBidi" w:hAnsiTheme="majorBidi" w:cstheme="majorBidi"/>
+        </w:rPr>
+        <w:t xml:space="preserve"> scores</w:t>
+      </w:r>
+      <w:r>
+        <w:rPr>
+          <w:rFonts w:asciiTheme="majorBidi" w:hAnsiTheme="majorBidi" w:cstheme="majorBidi"/>
         </w:rPr>
         <w:t>.</w:t>
       </w:r>
       <w:r>
         <w:rPr>
-          <w:rFonts w:ascii="Times New Roman" w:hAnsi="Times New Roman" w:cs="Times New Roman"/>
-        </w:rPr>
-        <w:t xml:space="preserve"> Categorical covariates were condensed after consulting investigator to avoid small sample sizes.</w:t>
-      </w:r>
-    </w:p>
-    <w:p>
-      <w:pPr>
-        <w:spacing w:after="0" w:line="480" w:lineRule="auto"/>
-        <w:rPr>
-          <w:rFonts w:ascii="Times New Roman" w:hAnsi="Times New Roman" w:cs="Times New Roman"/>
-          <w:b/>
-          <w:bCs/>
-        </w:rPr>
-      </w:pPr>
-      <w:r>
-        <w:rPr>
-          <w:rFonts w:ascii="Times New Roman" w:hAnsi="Times New Roman" w:cs="Times New Roman"/>
-          <w:b/>
-          <w:bCs/>
-        </w:rPr>
-        <w:t>2.2 Statistical Analysis</w:t>
-      </w:r>
-    </w:p>
-    <w:p>
-      <w:pPr>
-        <w:spacing w:after="0" w:line="480" w:lineRule="auto"/>
-        <w:rPr>
-          <w:rFonts w:asciiTheme="majorBidi" w:hAnsiTheme="majorBidi" w:cstheme="majorBidi"/>
-        </w:rPr>
-      </w:pPr>
-      <w:r>
-        <w:rPr>
-          <w:rFonts w:asciiTheme="majorBidi" w:hAnsiTheme="majorBidi" w:cstheme="majorBidi"/>
-        </w:rPr>
-        <w:t>The impact of baseline hard drug use on treatment response was evaluated for each of the four outcomes of interest using both frequentist and Bayesian linear regression frameworks.</w:t>
-      </w:r>
-      <w:r>
-        <w:rPr>
-          <w:rFonts w:asciiTheme="majorBidi" w:hAnsiTheme="majorBidi" w:cstheme="majorBidi"/>
-        </w:rPr>
-        <w:t xml:space="preserve"> Those outcomes were </w:t>
-      </w:r>
-      <w:r>
-        <w:rPr>
-          <w:rFonts w:asciiTheme="majorBidi" w:hAnsiTheme="majorBidi" w:cstheme="majorBidi"/>
-        </w:rPr>
-        <w:t>viral load, CD4+ T cell count, physical quality of life, and mental quality of life</w:t>
-      </w:r>
-      <w:r>
-        <w:rPr>
-          <w:rFonts w:asciiTheme="majorBidi" w:hAnsiTheme="majorBidi" w:cstheme="majorBidi"/>
-        </w:rPr>
-        <w:t>.</w:t>
-      </w:r>
-      <w:r>
-        <w:rPr>
           <w:rFonts w:asciiTheme="majorBidi" w:hAnsiTheme="majorBidi" w:cstheme="majorBidi"/>
         </w:rPr>
         <w:t xml:space="preserve"> </w:t>
@@ -551,13 +679,7 @@
         <w:rPr>
           <w:rFonts w:asciiTheme="majorBidi" w:hAnsiTheme="majorBidi" w:cstheme="majorBidi"/>
         </w:rPr>
-        <w:t xml:space="preserve">For the frequentist approach, </w:t>
-      </w:r>
-      <w:r>
-        <w:rPr>
-          <w:rFonts w:asciiTheme="majorBidi" w:hAnsiTheme="majorBidi" w:cstheme="majorBidi"/>
-        </w:rPr>
-        <w:t>ordinary least squares linear regression was used.</w:t>
+        <w:t>For the frequentist approach, ordinary least squares linear regression was used.</w:t>
       </w:r>
       <w:r>
         <w:rPr>
@@ -772,7 +894,23 @@
           <w:b/>
           <w:bCs/>
         </w:rPr>
-        <w:t>1 Effect Hard Drug Use on Treatment Response</w:t>
+        <w:t xml:space="preserve">1 Effect </w:t>
+      </w:r>
+      <w:r>
+        <w:rPr>
+          <w:rFonts w:asciiTheme="majorBidi" w:hAnsiTheme="majorBidi" w:cstheme="majorBidi"/>
+          <w:b/>
+          <w:bCs/>
+        </w:rPr>
+        <w:t xml:space="preserve">of </w:t>
+      </w:r>
+      <w:r>
+        <w:rPr>
+          <w:rFonts w:asciiTheme="majorBidi" w:hAnsiTheme="majorBidi" w:cstheme="majorBidi"/>
+          <w:b/>
+          <w:bCs/>
+        </w:rPr>
+        <w:t>Hard Drug Use on Treatment Response</w:t>
       </w:r>
     </w:p>
     <w:p>
@@ -798,7 +936,19 @@
         <w:rPr>
           <w:rFonts w:asciiTheme="majorBidi" w:hAnsiTheme="majorBidi" w:cstheme="majorBidi"/>
         </w:rPr>
-        <w:t>. Across all four outcomes, the two approaches yielded virtually identical results, with matching estimates for viral load and physical quality of life, and nearly identical estimates for CD4+ T cell count</w:t>
+        <w:t>. Across all four outcomes, the two approaches yielded virtually identical results, with matching estimates for viral load and physical quality of life</w:t>
+      </w:r>
+      <w:r>
+        <w:rPr>
+          <w:rFonts w:asciiTheme="majorBidi" w:hAnsiTheme="majorBidi" w:cstheme="majorBidi"/>
+        </w:rPr>
+        <w:t xml:space="preserve"> score</w:t>
+      </w:r>
+      <w:r>
+        <w:rPr>
+          <w:rFonts w:asciiTheme="majorBidi" w:hAnsiTheme="majorBidi" w:cstheme="majorBidi"/>
+        </w:rPr>
+        <w:t>, and nearly identical estimates for CD4+ T cell count</w:t>
       </w:r>
       <w:r>
         <w:rPr>
@@ -810,16 +960,20 @@
         <w:rPr>
           <w:rFonts w:asciiTheme="majorBidi" w:hAnsiTheme="majorBidi" w:cstheme="majorBidi"/>
         </w:rPr>
-        <w:t>mental quality of life. The 95% confidence intervals and highest posterior density intervals were slightly different in width but led to the same conclusions for all outcomes.</w:t>
-      </w:r>
-    </w:p>
-    <w:p>
-      <w:pPr>
-        <w:spacing w:after="0" w:line="480" w:lineRule="auto"/>
-        <w:rPr>
-          <w:rFonts w:asciiTheme="majorBidi" w:hAnsiTheme="majorBidi" w:cstheme="majorBidi"/>
-        </w:rPr>
-      </w:pPr>
+        <w:t>mental quality of life</w:t>
+      </w:r>
+      <w:r>
+        <w:rPr>
+          <w:rFonts w:asciiTheme="majorBidi" w:hAnsiTheme="majorBidi" w:cstheme="majorBidi"/>
+        </w:rPr>
+        <w:t xml:space="preserve"> score</w:t>
+      </w:r>
+      <w:r>
+        <w:rPr>
+          <w:rFonts w:asciiTheme="majorBidi" w:hAnsiTheme="majorBidi" w:cstheme="majorBidi"/>
+        </w:rPr>
+        <w:t>. The 95% confidence intervals and highest posterior density intervals were slightly different in width but led to the same conclusions for all outcomes.</w:t>
+      </w:r>
     </w:p>
     <w:p>
       <w:pPr>
@@ -836,6 +990,7 @@
           <w:bCs/>
           <w:noProof/>
         </w:rPr>
+        <w:lastRenderedPageBreak/>
         <w:t>Table 1.</w:t>
       </w:r>
       <w:r>
@@ -1001,7 +1156,19 @@
         <w:rPr>
           <w:rFonts w:asciiTheme="majorBidi" w:hAnsiTheme="majorBidi" w:cstheme="majorBidi"/>
         </w:rPr>
-        <w:t xml:space="preserve">). Physical quality of life also showed a significant negative association with baseline hard drug use (β = -3.28, 95% CI: </w:t>
+        <w:t xml:space="preserve">). Physical quality of life </w:t>
+      </w:r>
+      <w:r>
+        <w:rPr>
+          <w:rFonts w:asciiTheme="majorBidi" w:hAnsiTheme="majorBidi" w:cstheme="majorBidi"/>
+        </w:rPr>
+        <w:t xml:space="preserve">score </w:t>
+      </w:r>
+      <w:r>
+        <w:rPr>
+          <w:rFonts w:asciiTheme="majorBidi" w:hAnsiTheme="majorBidi" w:cstheme="majorBidi"/>
+        </w:rPr>
+        <w:t xml:space="preserve">also showed a significant negative association with baseline hard drug use (β = -3.28, 95% CI: </w:t>
       </w:r>
       <w:r>
         <w:rPr>
@@ -1055,83 +1222,89 @@
         <w:rPr>
           <w:rFonts w:asciiTheme="majorBidi" w:hAnsiTheme="majorBidi" w:cstheme="majorBidi"/>
         </w:rPr>
-        <w:t xml:space="preserve">. No meaningful associations were observed for viral </w:t>
-      </w:r>
-      <w:r>
-        <w:rPr>
-          <w:rFonts w:asciiTheme="majorBidi" w:hAnsiTheme="majorBidi" w:cstheme="majorBidi"/>
+        <w:t xml:space="preserve">. No meaningful associations were observed for viral load (β = -0.20, 95% CI: </w:t>
+      </w:r>
+      <w:r>
+        <w:rPr>
+          <w:rFonts w:asciiTheme="majorBidi" w:hAnsiTheme="majorBidi" w:cstheme="majorBidi"/>
+        </w:rPr>
+        <w:t>(</w:t>
+      </w:r>
+      <w:r>
+        <w:rPr>
+          <w:rFonts w:asciiTheme="majorBidi" w:hAnsiTheme="majorBidi" w:cstheme="majorBidi"/>
+        </w:rPr>
+        <w:t>-0.59, 0.20</w:t>
+      </w:r>
+      <w:r>
+        <w:rPr>
+          <w:rFonts w:asciiTheme="majorBidi" w:hAnsiTheme="majorBidi" w:cstheme="majorBidi"/>
+        </w:rPr>
+        <w:t>), p = 0.325</w:t>
+      </w:r>
+      <w:r>
+        <w:rPr>
+          <w:rFonts w:asciiTheme="majorBidi" w:hAnsiTheme="majorBidi" w:cstheme="majorBidi"/>
+        </w:rPr>
+        <w:t>) or mental quality of life</w:t>
+      </w:r>
+      <w:r>
+        <w:rPr>
+          <w:rFonts w:asciiTheme="majorBidi" w:hAnsiTheme="majorBidi" w:cstheme="majorBidi"/>
+        </w:rPr>
+        <w:t xml:space="preserve"> score</w:t>
+      </w:r>
+      <w:r>
+        <w:rPr>
+          <w:rFonts w:asciiTheme="majorBidi" w:hAnsiTheme="majorBidi" w:cstheme="majorBidi"/>
+        </w:rPr>
+        <w:t xml:space="preserve"> (β = 0.06, 95% CI: </w:t>
+      </w:r>
+      <w:r>
+        <w:rPr>
+          <w:rFonts w:asciiTheme="majorBidi" w:hAnsiTheme="majorBidi" w:cstheme="majorBidi"/>
+        </w:rPr>
+        <w:t>(</w:t>
+      </w:r>
+      <w:r>
+        <w:rPr>
+          <w:rFonts w:asciiTheme="majorBidi" w:hAnsiTheme="majorBidi" w:cstheme="majorBidi"/>
+        </w:rPr>
+        <w:t>-3.5, 3.62</w:t>
+      </w:r>
+      <w:r>
+        <w:rPr>
+          <w:rFonts w:asciiTheme="majorBidi" w:hAnsiTheme="majorBidi" w:cstheme="majorBidi"/>
+        </w:rPr>
+        <w:t>), p =</w:t>
+      </w:r>
+      <w:r>
+        <w:rPr>
+          <w:rFonts w:asciiTheme="majorBidi" w:hAnsiTheme="majorBidi" w:cstheme="majorBidi"/>
+        </w:rPr>
+        <w:t xml:space="preserve"> 0.974</w:t>
+      </w:r>
+      <w:r>
+        <w:rPr>
+          <w:rFonts w:asciiTheme="majorBidi" w:hAnsiTheme="majorBidi" w:cstheme="majorBidi"/>
+        </w:rPr>
+        <w:t>).</w:t>
+      </w:r>
+    </w:p>
+    <w:p>
+      <w:pPr>
+        <w:spacing w:after="0" w:line="480" w:lineRule="auto"/>
+        <w:rPr>
+          <w:rFonts w:asciiTheme="majorBidi" w:hAnsiTheme="majorBidi" w:cstheme="majorBidi"/>
+        </w:rPr>
+      </w:pPr>
+      <w:r>
+        <w:rPr>
+          <w:rFonts w:asciiTheme="majorBidi" w:hAnsiTheme="majorBidi" w:cstheme="majorBidi"/>
+          <w:b/>
+          <w:bCs/>
         </w:rPr>
         <w:lastRenderedPageBreak/>
-        <w:t xml:space="preserve">load (β = -0.20, 95% CI: </w:t>
-      </w:r>
-      <w:r>
-        <w:rPr>
-          <w:rFonts w:asciiTheme="majorBidi" w:hAnsiTheme="majorBidi" w:cstheme="majorBidi"/>
-        </w:rPr>
-        <w:t>(</w:t>
-      </w:r>
-      <w:r>
-        <w:rPr>
-          <w:rFonts w:asciiTheme="majorBidi" w:hAnsiTheme="majorBidi" w:cstheme="majorBidi"/>
-        </w:rPr>
-        <w:t>-0.59, 0.20</w:t>
-      </w:r>
-      <w:r>
-        <w:rPr>
-          <w:rFonts w:asciiTheme="majorBidi" w:hAnsiTheme="majorBidi" w:cstheme="majorBidi"/>
-        </w:rPr>
-        <w:t>), p = 0.325</w:t>
-      </w:r>
-      <w:r>
-        <w:rPr>
-          <w:rFonts w:asciiTheme="majorBidi" w:hAnsiTheme="majorBidi" w:cstheme="majorBidi"/>
-        </w:rPr>
-        <w:t xml:space="preserve">) or mental quality of life (β = 0.06, 95% CI: </w:t>
-      </w:r>
-      <w:r>
-        <w:rPr>
-          <w:rFonts w:asciiTheme="majorBidi" w:hAnsiTheme="majorBidi" w:cstheme="majorBidi"/>
-        </w:rPr>
-        <w:t>(</w:t>
-      </w:r>
-      <w:r>
-        <w:rPr>
-          <w:rFonts w:asciiTheme="majorBidi" w:hAnsiTheme="majorBidi" w:cstheme="majorBidi"/>
-        </w:rPr>
-        <w:t>-3.5, 3.62</w:t>
-      </w:r>
-      <w:r>
-        <w:rPr>
-          <w:rFonts w:asciiTheme="majorBidi" w:hAnsiTheme="majorBidi" w:cstheme="majorBidi"/>
-        </w:rPr>
-        <w:t>), p =</w:t>
-      </w:r>
-      <w:r>
-        <w:rPr>
-          <w:rFonts w:asciiTheme="majorBidi" w:hAnsiTheme="majorBidi" w:cstheme="majorBidi"/>
-        </w:rPr>
-        <w:t xml:space="preserve"> 0.974</w:t>
-      </w:r>
-      <w:r>
-        <w:rPr>
-          <w:rFonts w:asciiTheme="majorBidi" w:hAnsiTheme="majorBidi" w:cstheme="majorBidi"/>
-        </w:rPr>
-        <w:t>), with both intervals including zero.</w:t>
-      </w:r>
-    </w:p>
-    <w:p>
-      <w:pPr>
-        <w:spacing w:after="0" w:line="480" w:lineRule="auto"/>
-        <w:rPr>
-          <w:rFonts w:asciiTheme="majorBidi" w:hAnsiTheme="majorBidi" w:cstheme="majorBidi"/>
-        </w:rPr>
-      </w:pPr>
-      <w:r>
-        <w:rPr>
-          <w:rFonts w:asciiTheme="majorBidi" w:hAnsiTheme="majorBidi" w:cstheme="majorBidi"/>
-          <w:b/>
-          <w:bCs/>
-        </w:rPr>
         <w:t>Table</w:t>
       </w:r>
       <w:r>
@@ -1179,9 +1352,9 @@
           <w:noProof/>
         </w:rPr>
         <w:drawing>
-          <wp:inline distT="0" distB="0" distL="0" distR="0" wp14:anchorId="0D89F94F" wp14:editId="6528AB36">
-            <wp:extent cx="4148667" cy="1329259"/>
-            <wp:effectExtent l="0" t="0" r="4445" b="4445"/>
+          <wp:inline distT="0" distB="0" distL="0" distR="0" wp14:anchorId="0D89F94F" wp14:editId="3A76E038">
+            <wp:extent cx="4428067" cy="1418780"/>
+            <wp:effectExtent l="0" t="0" r="4445" b="3810"/>
             <wp:docPr id="1786100974" name="Picture 8" descr="A table with numbers and a number of numbers&#10;&#10;AI-generated content may be incorrect."/>
             <wp:cNvGraphicFramePr>
               <a:graphicFrameLocks xmlns:a="http://schemas.openxmlformats.org/drawingml/2006/main" noChangeAspect="1"/>
@@ -1208,7 +1381,7 @@
                   <pic:spPr>
                     <a:xfrm>
                       <a:off x="0" y="0"/>
-                      <a:ext cx="4332256" cy="1388082"/>
+                      <a:ext cx="4682481" cy="1500296"/>
                     </a:xfrm>
                     <a:prstGeom prst="rect">
                       <a:avLst/>
@@ -1286,92 +1459,116 @@
         <w:rPr>
           <w:rFonts w:asciiTheme="majorBidi" w:hAnsiTheme="majorBidi" w:cstheme="majorBidi"/>
         </w:rPr>
+        <w:t xml:space="preserve"> As illustrated, t</w:t>
+      </w:r>
+      <w:r>
+        <w:rPr>
+          <w:rFonts w:asciiTheme="majorBidi" w:hAnsiTheme="majorBidi" w:cstheme="majorBidi"/>
+        </w:rPr>
+        <w:t xml:space="preserve">he inclusion of adherence had minimal impact on the estimated effect of hard drug use across all four outcomes. For CD4+ T cell count, the coefficient shifted slightly from -159.02 to -166.00 in the frequentist model, with the Bayesian estimate similarly moving from -143.47 to -148.64, and both remaining highly significant (p &lt; 0.001, </w:t>
+      </w:r>
+      <w:proofErr w:type="gramStart"/>
+      <w:r>
+        <w:rPr>
+          <w:rFonts w:asciiTheme="majorBidi" w:hAnsiTheme="majorBidi" w:cstheme="majorBidi"/>
+        </w:rPr>
+        <w:t>P(</w:t>
+      </w:r>
+      <w:proofErr w:type="gramEnd"/>
+      <w:r>
+        <w:rPr>
+          <w:rFonts w:asciiTheme="majorBidi" w:hAnsiTheme="majorBidi" w:cstheme="majorBidi"/>
+        </w:rPr>
+        <w:t>β &lt; 0) = 1.000). For physical quality of life</w:t>
+      </w:r>
+      <w:r>
+        <w:rPr>
+          <w:rFonts w:asciiTheme="majorBidi" w:hAnsiTheme="majorBidi" w:cstheme="majorBidi"/>
+        </w:rPr>
+        <w:t xml:space="preserve"> score</w:t>
+      </w:r>
+      <w:r>
+        <w:rPr>
+          <w:rFonts w:asciiTheme="majorBidi" w:hAnsiTheme="majorBidi" w:cstheme="majorBidi"/>
+        </w:rPr>
+        <w:t xml:space="preserve">, the estimate changed modestly from -3.28 to -3.47 (p = 0.013), with the Bayesian result consistent (Posterior Mean = -3.46, </w:t>
+      </w:r>
+      <w:proofErr w:type="gramStart"/>
+      <w:r>
+        <w:rPr>
+          <w:rFonts w:asciiTheme="majorBidi" w:hAnsiTheme="majorBidi" w:cstheme="majorBidi"/>
+        </w:rPr>
+        <w:t>P(</w:t>
+      </w:r>
+      <w:proofErr w:type="gramEnd"/>
+      <w:r>
+        <w:rPr>
+          <w:rFonts w:asciiTheme="majorBidi" w:hAnsiTheme="majorBidi" w:cstheme="majorBidi"/>
+        </w:rPr>
+        <w:t>β &lt; 0) = 0.993). Viral load and mental quality of life</w:t>
+      </w:r>
+      <w:r>
+        <w:rPr>
+          <w:rFonts w:asciiTheme="majorBidi" w:hAnsiTheme="majorBidi" w:cstheme="majorBidi"/>
+        </w:rPr>
+        <w:t xml:space="preserve"> score</w:t>
+      </w:r>
+      <w:r>
+        <w:rPr>
+          <w:rFonts w:asciiTheme="majorBidi" w:hAnsiTheme="majorBidi" w:cstheme="majorBidi"/>
+        </w:rPr>
+        <w:t xml:space="preserve"> remained non-significant in both models with and without adherence.</w:t>
+      </w:r>
+    </w:p>
+    <w:p>
+      <w:pPr>
+        <w:spacing w:after="0" w:line="480" w:lineRule="auto"/>
+        <w:rPr>
+          <w:rFonts w:ascii="Times New Roman" w:hAnsi="Times New Roman" w:cs="Times New Roman"/>
+        </w:rPr>
+      </w:pPr>
+      <w:r>
+        <w:rPr>
+          <w:rFonts w:ascii="Times New Roman" w:hAnsi="Times New Roman" w:cs="Times New Roman"/>
+          <w:b/>
+          <w:bCs/>
+        </w:rPr>
+        <w:t>Table 3.</w:t>
+      </w:r>
+      <w:r>
+        <w:rPr>
+          <w:rFonts w:ascii="Times New Roman" w:hAnsi="Times New Roman" w:cs="Times New Roman"/>
+          <w:b/>
+          <w:bCs/>
+        </w:rPr>
         <w:t xml:space="preserve"> </w:t>
       </w:r>
       <w:r>
         <w:rPr>
-          <w:rFonts w:asciiTheme="majorBidi" w:hAnsiTheme="majorBidi" w:cstheme="majorBidi"/>
-        </w:rPr>
-        <w:t>As illustrated, t</w:t>
-      </w:r>
-      <w:r>
-        <w:rPr>
-          <w:rFonts w:asciiTheme="majorBidi" w:hAnsiTheme="majorBidi" w:cstheme="majorBidi"/>
-        </w:rPr>
-        <w:t xml:space="preserve">he inclusion of adherence had minimal impact on the estimated effect of hard drug use across all four outcomes. For CD4+ T cell count, the coefficient shifted slightly from -159.02 to -166.00 in the frequentist model, with the Bayesian estimate similarly moving from -143.47 to -148.64, and both remaining highly significant (p &lt; 0.001, </w:t>
+          <w:rFonts w:ascii="Times New Roman" w:hAnsi="Times New Roman" w:cs="Times New Roman"/>
+        </w:rPr>
+        <w:t xml:space="preserve">Effect of Hard Drug Use on Outcomes </w:t>
       </w:r>
       <w:proofErr w:type="gramStart"/>
       <w:r>
         <w:rPr>
-          <w:rFonts w:asciiTheme="majorBidi" w:hAnsiTheme="majorBidi" w:cstheme="majorBidi"/>
-        </w:rPr>
-        <w:t>P(</w:t>
+          <w:rFonts w:ascii="Times New Roman" w:hAnsi="Times New Roman" w:cs="Times New Roman"/>
+        </w:rPr>
+        <w:t>With</w:t>
       </w:r>
       <w:proofErr w:type="gramEnd"/>
       <w:r>
         <w:rPr>
-          <w:rFonts w:asciiTheme="majorBidi" w:hAnsiTheme="majorBidi" w:cstheme="majorBidi"/>
-        </w:rPr>
-        <w:t xml:space="preserve">β &lt; 0) = 1.000). For physical quality of life, the estimate changed modestly from -3.28 to -3.47 (p = 0.013), with the Bayesian result consistent (Posterior Mean = -3.46, </w:t>
-      </w:r>
-      <w:proofErr w:type="gramStart"/>
-      <w:r>
-        <w:rPr>
-          <w:rFonts w:asciiTheme="majorBidi" w:hAnsiTheme="majorBidi" w:cstheme="majorBidi"/>
-        </w:rPr>
-        <w:t>P(</w:t>
-      </w:r>
-      <w:proofErr w:type="gramEnd"/>
-      <w:r>
-        <w:rPr>
-          <w:rFonts w:asciiTheme="majorBidi" w:hAnsiTheme="majorBidi" w:cstheme="majorBidi"/>
-        </w:rPr>
-        <w:t>β &lt; 0) = 0.993). Viral load and mental quality of life remained non-significant in both models with and without adherence.</w:t>
-      </w:r>
-    </w:p>
-    <w:p>
-      <w:pPr>
-        <w:spacing w:after="0" w:line="480" w:lineRule="auto"/>
-        <w:rPr>
-          <w:rFonts w:ascii="Times New Roman" w:hAnsi="Times New Roman" w:cs="Times New Roman"/>
-        </w:rPr>
-      </w:pPr>
-      <w:r>
-        <w:rPr>
-          <w:rFonts w:ascii="Times New Roman" w:hAnsi="Times New Roman" w:cs="Times New Roman"/>
-          <w:b/>
-          <w:bCs/>
-        </w:rPr>
-        <w:t>Table 3.</w:t>
-      </w:r>
-      <w:r>
-        <w:rPr>
-          <w:rFonts w:ascii="Times New Roman" w:hAnsi="Times New Roman" w:cs="Times New Roman"/>
-          <w:b/>
-          <w:bCs/>
-        </w:rPr>
-        <w:t xml:space="preserve"> </w:t>
-      </w:r>
-      <w:r>
-        <w:rPr>
-          <w:rFonts w:ascii="Times New Roman" w:hAnsi="Times New Roman" w:cs="Times New Roman"/>
-        </w:rPr>
-        <w:t xml:space="preserve">Effect of Hard Drug Use on Outcomes </w:t>
-      </w:r>
-      <w:proofErr w:type="gramStart"/>
-      <w:r>
-        <w:rPr>
-          <w:rFonts w:ascii="Times New Roman" w:hAnsi="Times New Roman" w:cs="Times New Roman"/>
-        </w:rPr>
-        <w:t>With</w:t>
-      </w:r>
-      <w:proofErr w:type="gramEnd"/>
-      <w:r>
-        <w:rPr>
           <w:rFonts w:ascii="Times New Roman" w:hAnsi="Times New Roman" w:cs="Times New Roman"/>
         </w:rPr>
         <w:t xml:space="preserve"> and Without Adjusting for Adherence</w:t>
       </w:r>
+      <w:r>
+        <w:rPr>
+          <w:rFonts w:ascii="Times New Roman" w:hAnsi="Times New Roman" w:cs="Times New Roman"/>
+        </w:rPr>
+        <w:t>.</w:t>
+      </w:r>
     </w:p>
     <w:p>
       <w:pPr>
@@ -1391,8 +1588,8 @@
           <w:noProof/>
         </w:rPr>
         <w:drawing>
-          <wp:inline distT="0" distB="0" distL="0" distR="0" wp14:anchorId="5D005AD7" wp14:editId="27AEBA93">
-            <wp:extent cx="4293235" cy="2150289"/>
+          <wp:inline distT="0" distB="0" distL="0" distR="0" wp14:anchorId="5D005AD7" wp14:editId="09634CFB">
+            <wp:extent cx="4767046" cy="2387600"/>
             <wp:effectExtent l="0" t="0" r="0" b="0"/>
             <wp:docPr id="779773918" name="Picture 9" descr="A table with numbers and a number of numbers&#10;&#10;AI-generated content may be incorrect."/>
             <wp:cNvGraphicFramePr>
@@ -1420,7 +1617,7 @@
                   <pic:spPr>
                     <a:xfrm>
                       <a:off x="0" y="0"/>
-                      <a:ext cx="4655759" cy="2331861"/>
+                      <a:ext cx="5185705" cy="2597287"/>
                     </a:xfrm>
                     <a:prstGeom prst="rect">
                       <a:avLst/>
@@ -1435,52 +1632,28 @@
     </w:p>
     <w:p>
       <w:pPr>
-        <w:spacing w:line="480" w:lineRule="auto"/>
-        <w:rPr>
-          <w:rFonts w:asciiTheme="majorBidi" w:hAnsiTheme="majorBidi" w:cstheme="majorBidi"/>
-        </w:rPr>
-      </w:pPr>
-      <w:r>
-        <w:rPr>
-          <w:rFonts w:asciiTheme="majorBidi" w:hAnsiTheme="majorBidi" w:cstheme="majorBidi"/>
+        <w:spacing w:after="0" w:line="480" w:lineRule="auto"/>
+        <w:rPr>
+          <w:rFonts w:asciiTheme="majorBidi" w:hAnsiTheme="majorBidi" w:cstheme="majorBidi"/>
+        </w:rPr>
+      </w:pPr>
+    </w:p>
+    <w:p>
+      <w:pPr>
+        <w:spacing w:after="0" w:line="480" w:lineRule="auto"/>
+        <w:rPr>
+          <w:rFonts w:asciiTheme="majorBidi" w:hAnsiTheme="majorBidi" w:cstheme="majorBidi"/>
+          <w:b/>
+          <w:bCs/>
+        </w:rPr>
+      </w:pPr>
+      <w:r>
+        <w:rPr>
+          <w:rFonts w:asciiTheme="majorBidi" w:hAnsiTheme="majorBidi" w:cstheme="majorBidi"/>
+          <w:b/>
+          <w:bCs/>
         </w:rPr>
         <w:lastRenderedPageBreak/>
-        <w:t xml:space="preserve">Overall, the addition of adherence did not meaningfully </w:t>
-      </w:r>
-      <w:r>
-        <w:rPr>
-          <w:rFonts w:asciiTheme="majorBidi" w:hAnsiTheme="majorBidi" w:cstheme="majorBidi"/>
-        </w:rPr>
-        <w:t xml:space="preserve">affect </w:t>
-      </w:r>
-      <w:r>
-        <w:rPr>
-          <w:rFonts w:asciiTheme="majorBidi" w:hAnsiTheme="majorBidi" w:cstheme="majorBidi"/>
-        </w:rPr>
-        <w:t xml:space="preserve">the effect of hard drug use on any outcome, suggesting adherence does not substantially account for the observed differences in </w:t>
-      </w:r>
-      <w:r>
-        <w:rPr>
-          <w:rFonts w:asciiTheme="majorBidi" w:hAnsiTheme="majorBidi" w:cstheme="majorBidi"/>
-        </w:rPr>
-        <w:t>treatment response between groups.</w:t>
-      </w:r>
-    </w:p>
-    <w:p>
-      <w:pPr>
-        <w:spacing w:after="0" w:line="480" w:lineRule="auto"/>
-        <w:rPr>
-          <w:rFonts w:asciiTheme="majorBidi" w:hAnsiTheme="majorBidi" w:cstheme="majorBidi"/>
-          <w:b/>
-          <w:bCs/>
-        </w:rPr>
-      </w:pPr>
-      <w:r>
-        <w:rPr>
-          <w:rFonts w:asciiTheme="majorBidi" w:hAnsiTheme="majorBidi" w:cstheme="majorBidi"/>
-          <w:b/>
-          <w:bCs/>
-        </w:rPr>
         <w:t>4 Discussion</w:t>
       </w:r>
     </w:p>
@@ -1495,37 +1668,159 @@
         <w:rPr>
           <w:rFonts w:asciiTheme="majorBidi" w:hAnsiTheme="majorBidi" w:cstheme="majorBidi"/>
         </w:rPr>
-        <w:t>This study examined the impact of baseline hard drug use on treatment response two years after initiating HAART using both frequentist and Bayesian linear regression frameworks. Baseline hard drug use was associated with statistically significant reductions in CD4+ T cell count (β = -159.02, p &lt; 0.001) and physical quality of life (β = -3.28, p = 0.019), while no significant associations were observed for viral load or mental quality of life. [Insert clinical meaningfulness commentary here]. The absence of a significant association with viral load may reflect the effectiveness of HAART in suppressing viral replication regardless of hard drug use status.</w:t>
-      </w:r>
-    </w:p>
-    <w:p>
-      <w:pPr>
-        <w:spacing w:after="0" w:line="480" w:lineRule="auto"/>
-        <w:rPr>
-          <w:rFonts w:asciiTheme="majorBidi" w:hAnsiTheme="majorBidi" w:cstheme="majorBidi"/>
-        </w:rPr>
-      </w:pPr>
-      <w:r>
-        <w:rPr>
-          <w:rFonts w:asciiTheme="majorBidi" w:hAnsiTheme="majorBidi" w:cstheme="majorBidi"/>
-        </w:rPr>
-        <w:t>The addition of treatment adherence did not meaningfully attenuate the effect of hard drug use on any outcome, with coefficients remaining largely unchanged. This suggests the relationship between hard drug use and treatment outcomes operates through mechanisms beyond adherence alone, potentially through direct pharmacological or immunological pathways.</w:t>
-      </w:r>
-    </w:p>
-    <w:p>
-      <w:pPr>
-        <w:spacing w:after="0" w:line="480" w:lineRule="auto"/>
-        <w:rPr>
-          <w:rFonts w:asciiTheme="majorBidi" w:hAnsiTheme="majorBidi" w:cstheme="majorBidi"/>
-          <w:b/>
-          <w:bCs/>
-        </w:rPr>
-      </w:pPr>
-      <w:r>
-        <w:rPr>
-          <w:rFonts w:asciiTheme="majorBidi" w:hAnsiTheme="majorBidi" w:cstheme="majorBidi"/>
-        </w:rPr>
-        <w:t>The consistency between the frequentist and Bayesian approaches across all outcomes strengthens confidence in these findings, with near-identical point estimates and high posterior probabilities for the two significant outcomes. Several limitations should be noted, including the small sample of hard drug users (n = 36), assessment of hard drug use only at baseline, and the observational study design which precludes causal inference.</w:t>
+        <w:t xml:space="preserve">This study examined the impact of baseline hard drug use on treatment response two years after initiating HAART using both frequentist and Bayesian linear regression frameworks. Baseline hard drug use was associated with statistically significant reductions in CD4+ T cell count (β = -159.02, p &lt; 0.001) and physical quality of life </w:t>
+      </w:r>
+      <w:r>
+        <w:rPr>
+          <w:rFonts w:asciiTheme="majorBidi" w:hAnsiTheme="majorBidi" w:cstheme="majorBidi"/>
+        </w:rPr>
+        <w:t xml:space="preserve">score </w:t>
+      </w:r>
+      <w:r>
+        <w:rPr>
+          <w:rFonts w:asciiTheme="majorBidi" w:hAnsiTheme="majorBidi" w:cstheme="majorBidi"/>
+        </w:rPr>
+        <w:t>(β = -3.28, p = 0.019), while no significant associations were observed for viral load or mental quality of life</w:t>
+      </w:r>
+      <w:r>
+        <w:rPr>
+          <w:rFonts w:asciiTheme="majorBidi" w:hAnsiTheme="majorBidi" w:cstheme="majorBidi"/>
+        </w:rPr>
+        <w:t xml:space="preserve"> score</w:t>
+      </w:r>
+      <w:r>
+        <w:rPr>
+          <w:rFonts w:asciiTheme="majorBidi" w:hAnsiTheme="majorBidi" w:cstheme="majorBidi"/>
+        </w:rPr>
+        <w:t xml:space="preserve">. </w:t>
+      </w:r>
+      <w:r>
+        <w:rPr>
+          <w:rFonts w:asciiTheme="majorBidi" w:hAnsiTheme="majorBidi" w:cstheme="majorBidi"/>
+        </w:rPr>
+        <w:t xml:space="preserve">Both significant associations exceeded clinically meaningful thresholds defined a priori, with the reduction in CD4+ T cell count surpassing the </w:t>
+      </w:r>
+      <w:proofErr w:type="gramStart"/>
+      <w:r>
+        <w:rPr>
+          <w:rFonts w:asciiTheme="majorBidi" w:hAnsiTheme="majorBidi" w:cstheme="majorBidi"/>
+        </w:rPr>
+        <w:t>50 cell</w:t>
+      </w:r>
+      <w:proofErr w:type="gramEnd"/>
+      <w:r>
+        <w:rPr>
+          <w:rFonts w:asciiTheme="majorBidi" w:hAnsiTheme="majorBidi" w:cstheme="majorBidi"/>
+        </w:rPr>
+        <w:t xml:space="preserve"> threshold and the decline in physical quality of life</w:t>
+      </w:r>
+      <w:r>
+        <w:rPr>
+          <w:rFonts w:asciiTheme="majorBidi" w:hAnsiTheme="majorBidi" w:cstheme="majorBidi"/>
+        </w:rPr>
+        <w:t xml:space="preserve"> score</w:t>
+      </w:r>
+      <w:r>
+        <w:rPr>
+          <w:rFonts w:asciiTheme="majorBidi" w:hAnsiTheme="majorBidi" w:cstheme="majorBidi"/>
+        </w:rPr>
+        <w:t xml:space="preserve"> exceeding the </w:t>
+      </w:r>
+      <w:r>
+        <w:rPr>
+          <w:rFonts w:asciiTheme="majorBidi" w:hAnsiTheme="majorBidi" w:cstheme="majorBidi"/>
+        </w:rPr>
+        <w:t>2-point</w:t>
+      </w:r>
+      <w:r>
+        <w:rPr>
+          <w:rFonts w:asciiTheme="majorBidi" w:hAnsiTheme="majorBidi" w:cstheme="majorBidi"/>
+        </w:rPr>
+        <w:t xml:space="preserve"> threshold.</w:t>
+      </w:r>
+      <w:r>
+        <w:rPr>
+          <w:rFonts w:asciiTheme="majorBidi" w:hAnsiTheme="majorBidi" w:cstheme="majorBidi"/>
+        </w:rPr>
+        <w:t xml:space="preserve"> On the other hand</w:t>
+      </w:r>
+      <w:r>
+        <w:rPr>
+          <w:rFonts w:asciiTheme="majorBidi" w:hAnsiTheme="majorBidi" w:cstheme="majorBidi"/>
+        </w:rPr>
+        <w:t>, the differences observed for viral load and mental quality of life</w:t>
+      </w:r>
+      <w:r>
+        <w:rPr>
+          <w:rFonts w:asciiTheme="majorBidi" w:hAnsiTheme="majorBidi" w:cstheme="majorBidi"/>
+        </w:rPr>
+        <w:t xml:space="preserve"> score</w:t>
+      </w:r>
+      <w:r>
+        <w:rPr>
+          <w:rFonts w:asciiTheme="majorBidi" w:hAnsiTheme="majorBidi" w:cstheme="majorBidi"/>
+        </w:rPr>
+        <w:t xml:space="preserve"> fell well below their respective thresholds of 0.5 log10 and 2 points.</w:t>
+      </w:r>
+    </w:p>
+    <w:p>
+      <w:pPr>
+        <w:spacing w:after="0" w:line="480" w:lineRule="auto"/>
+        <w:rPr>
+          <w:rFonts w:asciiTheme="majorBidi" w:hAnsiTheme="majorBidi" w:cstheme="majorBidi"/>
+        </w:rPr>
+      </w:pPr>
+      <w:r>
+        <w:rPr>
+          <w:rFonts w:asciiTheme="majorBidi" w:hAnsiTheme="majorBidi" w:cstheme="majorBidi"/>
+        </w:rPr>
+        <w:t xml:space="preserve">The addition of treatment adherence did not meaningfully </w:t>
+      </w:r>
+      <w:r>
+        <w:rPr>
+          <w:rFonts w:asciiTheme="majorBidi" w:hAnsiTheme="majorBidi" w:cstheme="majorBidi"/>
+        </w:rPr>
+        <w:t>change</w:t>
+      </w:r>
+      <w:r>
+        <w:rPr>
+          <w:rFonts w:asciiTheme="majorBidi" w:hAnsiTheme="majorBidi" w:cstheme="majorBidi"/>
+        </w:rPr>
+        <w:t xml:space="preserve"> the effect of hard drug use on any outcome, with coefficients remaining largely unchanged. This suggests the relationship between hard drug use and treatment outcomes operates through mechanisms beyond adherence alone</w:t>
+      </w:r>
+      <w:r>
+        <w:rPr>
+          <w:rFonts w:asciiTheme="majorBidi" w:hAnsiTheme="majorBidi" w:cstheme="majorBidi"/>
+        </w:rPr>
+        <w:t>.</w:t>
+      </w:r>
+    </w:p>
+    <w:p>
+      <w:pPr>
+        <w:spacing w:after="0" w:line="480" w:lineRule="auto"/>
+        <w:rPr>
+          <w:rFonts w:asciiTheme="majorBidi" w:hAnsiTheme="majorBidi" w:cstheme="majorBidi"/>
+          <w:b/>
+          <w:bCs/>
+        </w:rPr>
+      </w:pPr>
+      <w:r>
+        <w:rPr>
+          <w:rFonts w:asciiTheme="majorBidi" w:hAnsiTheme="majorBidi" w:cstheme="majorBidi"/>
+        </w:rPr>
+        <w:t>The consistency between the frequentist and Bayesian approaches across all outcomes strengthens confidence in these findings, with near-identical point estimates and high posterior probabilities for the two significant outcomes. Several limitations should be noted, including the small sample of hard drug users (n = 36)</w:t>
+      </w:r>
+      <w:r>
+        <w:rPr>
+          <w:rFonts w:asciiTheme="majorBidi" w:hAnsiTheme="majorBidi" w:cstheme="majorBidi"/>
+        </w:rPr>
+        <w:t xml:space="preserve"> and the </w:t>
+      </w:r>
+      <w:r>
+        <w:rPr>
+          <w:rFonts w:asciiTheme="majorBidi" w:hAnsiTheme="majorBidi" w:cstheme="majorBidi"/>
+        </w:rPr>
+        <w:t>assessment of hard drug use only at baseline.</w:t>
       </w:r>
     </w:p>
     <w:p>
@@ -1596,19 +1891,19 @@
         <w:rPr>
           <w:rFonts w:ascii="Times New Roman" w:hAnsi="Times New Roman" w:cs="Times New Roman"/>
         </w:rPr>
+        <w:t>Project1/Code/</w:t>
+      </w:r>
+      <w:r>
+        <w:rPr>
+          <w:rFonts w:ascii="Times New Roman" w:hAnsi="Times New Roman" w:cs="Times New Roman"/>
+        </w:rPr>
+        <w:t xml:space="preserve">, where there are separate scripts for data cleaning and analysis. The original </w:t>
+      </w:r>
+      <w:r>
+        <w:rPr>
+          <w:rFonts w:ascii="Times New Roman" w:hAnsi="Times New Roman" w:cs="Times New Roman"/>
+        </w:rPr>
         <w:lastRenderedPageBreak/>
-        <w:t>Project1/Code/</w:t>
-      </w:r>
-      <w:r>
-        <w:rPr>
-          <w:rFonts w:ascii="Times New Roman" w:hAnsi="Times New Roman" w:cs="Times New Roman"/>
-        </w:rPr>
-        <w:t xml:space="preserve">, where there are separate scripts for data cleaning and analysis. The original </w:t>
-      </w:r>
-      <w:r>
-        <w:rPr>
-          <w:rFonts w:ascii="Times New Roman" w:hAnsi="Times New Roman" w:cs="Times New Roman"/>
-        </w:rPr>
         <w:t>data</w:t>
       </w:r>
       <w:r>
@@ -1812,36 +2107,202 @@
     </w:p>
     <w:p>
       <w:pPr>
-        <w:spacing w:after="0" w:line="480" w:lineRule="auto"/>
-        <w:rPr>
-          <w:rFonts w:ascii="Times New Roman" w:hAnsi="Times New Roman" w:cs="Times New Roman"/>
-        </w:rPr>
-      </w:pPr>
-      <w:r>
-        <w:rPr>
-          <w:rFonts w:ascii="Times New Roman" w:hAnsi="Times New Roman" w:cs="Times New Roman"/>
-          <w:b/>
-          <w:bCs/>
-        </w:rPr>
+        <w:rPr>
+          <w:rFonts w:ascii="Times New Roman" w:hAnsi="Times New Roman" w:cs="Times New Roman"/>
+          <w:b/>
+          <w:bCs/>
+        </w:rPr>
+      </w:pPr>
+      <w:r>
+        <w:rPr>
+          <w:rFonts w:ascii="Times New Roman" w:hAnsi="Times New Roman" w:cs="Times New Roman"/>
+          <w:b/>
+          <w:bCs/>
+        </w:rPr>
+        <w:br w:type="page"/>
+      </w:r>
+    </w:p>
+    <w:p>
+      <w:pPr>
+        <w:spacing w:after="0" w:line="480" w:lineRule="auto"/>
+        <w:rPr>
+          <w:rFonts w:ascii="Times New Roman" w:hAnsi="Times New Roman" w:cs="Times New Roman"/>
+        </w:rPr>
+      </w:pPr>
+      <w:r>
+        <w:rPr>
+          <w:rFonts w:ascii="Times New Roman" w:hAnsi="Times New Roman" w:cs="Times New Roman"/>
+          <w:b/>
+          <w:bCs/>
+        </w:rPr>
+        <w:lastRenderedPageBreak/>
         <w:t>Figure 2.</w:t>
       </w:r>
       <w:r>
         <w:rPr>
           <w:rFonts w:ascii="Times New Roman" w:hAnsi="Times New Roman" w:cs="Times New Roman"/>
         </w:rPr>
-        <w:t xml:space="preserve"> Diagnostic Plots for Bayesian Approach.</w:t>
-      </w:r>
-    </w:p>
-    <w:p>
-      <w:pPr>
-        <w:spacing w:after="0" w:line="480" w:lineRule="auto"/>
-        <w:rPr>
-          <w:rFonts w:ascii="Times New Roman" w:hAnsi="Times New Roman" w:cs="Times New Roman"/>
-        </w:rPr>
-      </w:pPr>
+        <w:t xml:space="preserve"> Diagnostic Plots for Bayesian Approach</w:t>
+      </w:r>
+      <w:r>
+        <w:rPr>
+          <w:rFonts w:ascii="Times New Roman" w:hAnsi="Times New Roman" w:cs="Times New Roman"/>
+        </w:rPr>
+        <w:t xml:space="preserve"> without adherence</w:t>
+      </w:r>
+    </w:p>
+    <w:p>
+      <w:pPr>
+        <w:spacing w:after="0" w:line="480" w:lineRule="auto"/>
+        <w:jc w:val="center"/>
+        <w:rPr>
+          <w:rFonts w:ascii="Times New Roman" w:hAnsi="Times New Roman" w:cs="Times New Roman"/>
+        </w:rPr>
+      </w:pPr>
+      <w:r>
+        <w:rPr>
+          <w:rFonts w:ascii="Times New Roman" w:hAnsi="Times New Roman" w:cs="Times New Roman"/>
+          <w:noProof/>
+        </w:rPr>
+        <w:drawing>
+          <wp:inline distT="0" distB="0" distL="0" distR="0" wp14:anchorId="134680A9" wp14:editId="675C01E0">
+            <wp:extent cx="4441966" cy="3331474"/>
+            <wp:effectExtent l="0" t="0" r="0" b="0"/>
+            <wp:docPr id="486347187" name="Picture 1" descr="A group of graphs showing different types of data&#10;&#10;AI-generated content may be incorrect."/>
+            <wp:cNvGraphicFramePr>
+              <a:graphicFrameLocks xmlns:a="http://schemas.openxmlformats.org/drawingml/2006/main" noChangeAspect="1"/>
+            </wp:cNvGraphicFramePr>
+            <a:graphic xmlns:a="http://schemas.openxmlformats.org/drawingml/2006/main">
+              <a:graphicData uri="http://schemas.openxmlformats.org/drawingml/2006/picture">
+                <pic:pic xmlns:pic="http://schemas.openxmlformats.org/drawingml/2006/picture">
+                  <pic:nvPicPr>
+                    <pic:cNvPr id="486347187" name="Picture 1" descr="A group of graphs showing different types of data&#10;&#10;AI-generated content may be incorrect."/>
+                    <pic:cNvPicPr/>
+                  </pic:nvPicPr>
+                  <pic:blipFill>
+                    <a:blip r:embed="rId11">
+                      <a:extLst>
+                        <a:ext uri="{28A0092B-C50C-407E-A947-70E740481C1C}">
+                          <a14:useLocalDpi xmlns:a14="http://schemas.microsoft.com/office/drawing/2010/main" val="0"/>
+                        </a:ext>
+                      </a:extLst>
+                    </a:blip>
+                    <a:stretch>
+                      <a:fillRect/>
+                    </a:stretch>
+                  </pic:blipFill>
+                  <pic:spPr>
+                    <a:xfrm>
+                      <a:off x="0" y="0"/>
+                      <a:ext cx="4474219" cy="3355664"/>
+                    </a:xfrm>
+                    <a:prstGeom prst="rect">
+                      <a:avLst/>
+                    </a:prstGeom>
+                  </pic:spPr>
+                </pic:pic>
+              </a:graphicData>
+            </a:graphic>
+          </wp:inline>
+        </w:drawing>
+      </w:r>
+    </w:p>
+    <w:p>
+      <w:pPr>
+        <w:spacing w:after="0" w:line="480" w:lineRule="auto"/>
+        <w:rPr>
+          <w:rFonts w:ascii="Times New Roman" w:hAnsi="Times New Roman" w:cs="Times New Roman"/>
+        </w:rPr>
+      </w:pPr>
+      <w:r>
+        <w:rPr>
+          <w:rFonts w:ascii="Times New Roman" w:hAnsi="Times New Roman" w:cs="Times New Roman"/>
+          <w:b/>
+          <w:bCs/>
+        </w:rPr>
+        <w:t xml:space="preserve">Figure </w:t>
+      </w:r>
+      <w:r>
+        <w:rPr>
+          <w:rFonts w:ascii="Times New Roman" w:hAnsi="Times New Roman" w:cs="Times New Roman"/>
+          <w:b/>
+          <w:bCs/>
+        </w:rPr>
+        <w:t>3</w:t>
+      </w:r>
+      <w:r>
+        <w:rPr>
+          <w:rFonts w:ascii="Times New Roman" w:hAnsi="Times New Roman" w:cs="Times New Roman"/>
+          <w:b/>
+          <w:bCs/>
+        </w:rPr>
+        <w:t>.</w:t>
+      </w:r>
+      <w:r>
+        <w:rPr>
+          <w:rFonts w:ascii="Times New Roman" w:hAnsi="Times New Roman" w:cs="Times New Roman"/>
+        </w:rPr>
+        <w:t xml:space="preserve"> Diagnostic Plots for Bayesian Approach with adherence</w:t>
+      </w:r>
+    </w:p>
+    <w:p>
+      <w:pPr>
+        <w:spacing w:after="0" w:line="480" w:lineRule="auto"/>
+        <w:jc w:val="center"/>
+        <w:rPr>
+          <w:rFonts w:ascii="Times New Roman" w:hAnsi="Times New Roman" w:cs="Times New Roman"/>
+        </w:rPr>
+      </w:pPr>
+      <w:r>
+        <w:rPr>
+          <w:rFonts w:ascii="Times New Roman" w:hAnsi="Times New Roman" w:cs="Times New Roman"/>
+          <w:noProof/>
+        </w:rPr>
+        <w:drawing>
+          <wp:inline distT="0" distB="0" distL="0" distR="0" wp14:anchorId="12ACD3CB" wp14:editId="42C8A29F">
+            <wp:extent cx="4442177" cy="3331633"/>
+            <wp:effectExtent l="0" t="0" r="0" b="0"/>
+            <wp:docPr id="2066922521" name="Picture 2" descr="A group of graphs showing different types of data&#10;&#10;AI-generated content may be incorrect."/>
+            <wp:cNvGraphicFramePr>
+              <a:graphicFrameLocks xmlns:a="http://schemas.openxmlformats.org/drawingml/2006/main" noChangeAspect="1"/>
+            </wp:cNvGraphicFramePr>
+            <a:graphic xmlns:a="http://schemas.openxmlformats.org/drawingml/2006/main">
+              <a:graphicData uri="http://schemas.openxmlformats.org/drawingml/2006/picture">
+                <pic:pic xmlns:pic="http://schemas.openxmlformats.org/drawingml/2006/picture">
+                  <pic:nvPicPr>
+                    <pic:cNvPr id="2066922521" name="Picture 2" descr="A group of graphs showing different types of data&#10;&#10;AI-generated content may be incorrect."/>
+                    <pic:cNvPicPr/>
+                  </pic:nvPicPr>
+                  <pic:blipFill>
+                    <a:blip r:embed="rId12">
+                      <a:extLst>
+                        <a:ext uri="{28A0092B-C50C-407E-A947-70E740481C1C}">
+                          <a14:useLocalDpi xmlns:a14="http://schemas.microsoft.com/office/drawing/2010/main" val="0"/>
+                        </a:ext>
+                      </a:extLst>
+                    </a:blip>
+                    <a:stretch>
+                      <a:fillRect/>
+                    </a:stretch>
+                  </pic:blipFill>
+                  <pic:spPr>
+                    <a:xfrm>
+                      <a:off x="0" y="0"/>
+                      <a:ext cx="4469103" cy="3351828"/>
+                    </a:xfrm>
+                    <a:prstGeom prst="rect">
+                      <a:avLst/>
+                    </a:prstGeom>
+                  </pic:spPr>
+                </pic:pic>
+              </a:graphicData>
+            </a:graphic>
+          </wp:inline>
+        </w:drawing>
+      </w:r>
     </w:p>
     <w:sectPr>
-      <w:headerReference w:type="first" r:id="rId11"/>
+      <w:headerReference w:type="first" r:id="rId13"/>
       <w:pgSz w:w="12240" w:h="15840"/>
       <w:pgMar w:top="1440" w:right="1440" w:bottom="1440" w:left="1440" w:header="720" w:footer="720" w:gutter="0"/>
       <w:cols w:space="720"/>

</xml_diff>